<commit_message>
Docs: update DocIQ_Project_Description.docx for PaddleOCR migration
- Replace all 16 Tesseract/pytesseract references with PaddleOCR 3.4+ (PP-OCRv4)
- Update OCR pipeline descriptions to reflect PaddleOCR's internal preprocessing
  (removes old OpenCV grayscale + thresholding references)
- Update deployment sections for multi-stage Docker with Nginx reverse proxy
- Update system requirements (no more Tesseract language packs needed)
- Update roadmap milestones: accent-flexible regex and raw text preservation
  replace old preprocessing tuning items
- Align with README.md and DEVELOPER.md updates from prior commits
</commit_message>
<xml_diff>
--- a/DocIQ_Project_Description.docx
+++ b/DocIQ_Project_Description.docx
@@ -123,15 +123,7 @@
           <w:sz w:val="24"/>
           <w:szCs w:val="24"/>
         </w:rPr>
-        <w:t xml:space="preserve">Classification: </w:t>
-      </w:r>
-      <w:r>
-        <w:rPr>
-          <w:color w:val="666666"/>
-          <w:sz w:val="24"/>
-          <w:szCs w:val="24"/>
-        </w:rPr>
-        <w:t>Public</w:t>
+        <w:t>Classification: Public</w:t>
       </w:r>
     </w:p>
     <w:p>
@@ -1093,7 +1085,7 @@
           </w:tcPr>
           <w:p>
             <w:r>
-              <w:t>Text-based PDFs use direct extraction via PyMuPDF (fitz). Scanned PDFs and images use OCR pipeline: pdf2image for page rendering, OpenCV for preprocessing (grayscale + thresholding), Tesseract for character recognition. Multithreaded per-page processing.</w:t>
+              <w:t>Text-based PDFs use direct extraction via PyMuPDF (fitz) with multithreaded per-page processing. Scanned PDFs and images use PaddleOCR 3.4+ (PP-OCRv4 models) running entirely on CPU. PaddleOCR handles its own image preprocessing (binarisation, deskew, orientation correction) internally. Pages are processed sequentially since PaddleOCR is not thread-safe.</w:t>
             </w:r>
           </w:p>
         </w:tc>
@@ -1331,11 +1323,6 @@
       </w:pPr>
       <w:r>
         <w:t>Layer 5 (Inference) supports a pluggable model architecture via the ModelRegistry and ModelBundle abstractions. Models are lazily loaded and registered per document type, allowing different NER/classification models to be swapped without modifying the pipeline orchestration. The RelationMapper bridges the gap between flat NER entity output and the structured schemas expected by the validators.</w:t>
-      </w:r>
-    </w:p>
-    <w:p>
-      <w:r>
-        <w:br w:type="page"/>
       </w:r>
     </w:p>
     <w:p>
@@ -1444,7 +1431,7 @@
         <w:t xml:space="preserve">Gate Decision: </w:t>
       </w:r>
       <w:r>
-        <w:t>Returns a boolean that routes the PDF to either the direct extraction path (PyMuPDF) or the OCR pipeline (pdf2image + Tesseract).</w:t>
+        <w:t>Returns a boolean that routes the PDF to either the direct extraction path (PyMuPDF) or the OCR pipeline (PaddleOCR).</w:t>
       </w:r>
     </w:p>
     <w:p>
@@ -1476,7 +1463,7 @@
         <w:t xml:space="preserve">OCR Extraction: </w:t>
       </w:r>
       <w:r>
-        <w:t>Converts PDF pages to images using pdf2image (Poppler backend), applies OpenCV preprocessing (grayscale conversion + binary thresholding at threshold 120), then runs Tesseract OCR on each page image. Also multithreaded.</w:t>
+        <w:t>Converts PDF pages to images using pdf2image (Poppler backend), then runs PaddleOCR on each page image sequentially. PaddleOCR handles its own preprocessing internally.</w:t>
       </w:r>
     </w:p>
     <w:p>
@@ -1532,7 +1519,7 @@
         <w:t xml:space="preserve">Workflow: </w:t>
       </w:r>
       <w:r>
-        <w:t>Loads image via OpenCV, applies preprocessing pipeline (grayscale + thresholding), converts to PIL Image, runs Tesseract OCR, and returns extracted text.</w:t>
+        <w:t>Loads image and delegates to the PaddleOCR singleton engine, which handles preprocessing internally, runs OCR, and returns extracted text.</w:t>
       </w:r>
     </w:p>
     <w:p>
@@ -1544,7 +1531,7 @@
         <w:t xml:space="preserve">Technologies: </w:t>
       </w:r>
       <w:r>
-        <w:t>OpenCV (cv2) for image loading and preprocessing, Pillow for format conversion, pytesseract for OCR execution.</w:t>
+        <w:t>PaddleOCR 3.4+ (PP-OCRv4) for OCR execution, managed as a thread-safe singleton with double-checked locking.</w:t>
       </w:r>
     </w:p>
     <w:p>
@@ -1622,7 +1609,7 @@
         <w:t xml:space="preserve">Image Preprocessing: </w:t>
       </w:r>
       <w:r>
-        <w:t>Converts BGR images to grayscale via OpenCV, then applies binary thresholding (threshold value: 120) to produce clean binary images for OCR.</w:t>
+        <w:t>Text normalisation utilities (Unicode cleanup, whitespace collapsing). PaddleOCR handles image preprocessing internally (binarisation, deskew, orientation correction).</w:t>
       </w:r>
     </w:p>
     <w:p>
@@ -2589,7 +2576,7 @@
           </w:tcPr>
           <w:p>
             <w:r>
-              <w:t>Tesseract (pytesseract)</w:t>
+              <w:t>PaddleOCR 3.4+ (PP-OCRv4)</w:t>
             </w:r>
           </w:p>
         </w:tc>
@@ -3474,7 +3461,7 @@
         <w:jc w:val="both"/>
       </w:pPr>
       <w:r>
-        <w:t>Text extraction: Text-based PDFs use direct PyMuPDF extraction with multithreaded per-page processing. Scanned PDFs use pdf2image to render pages, OpenCV preprocessing (grayscale + threshold), then Tesseract OCR. Images use the standalone OCR module.</w:t>
+        <w:t>Text extraction: Text-based PDFs use direct PyMuPDF extraction with multithreaded per-page processing. Scanned PDFs use pdf2image to render pages, then PaddleOCR for character recognition. Images use the same PaddleOCR singleton. All field matching uses accent-flexible regex that handles both accented text (PyMuPDF) and unaccented text (PaddleOCR output) transparently.</w:t>
       </w:r>
     </w:p>
     <w:p>
@@ -4075,7 +4062,7 @@
         <w:jc w:val="both"/>
       </w:pPr>
       <w:r>
-        <w:t>Primary: Any server or workstation with Python 3.10+ and Tesseract OCR installed. CPU-only operation is fully supported for the extraction pipeline.</w:t>
+        <w:t>Primary: Any server or workstation with Python 3.10+. CPU-only operation is fully supported. PaddleOCR runs entirely locally with no external API calls, suitable for sensitive medical data.</w:t>
       </w:r>
     </w:p>
     <w:p>
@@ -4150,7 +4137,7 @@
         <w:jc w:val="both"/>
       </w:pPr>
       <w:r>
-        <w:t>Tesseract OCR installed with appropriate language packs (English, Spanish).</w:t>
+        <w:t>PaddleOCR 3.4+ with PP-OCRv4 models (downloaded automatically on first use). The English/Latin model handles all Latin-script languages including Spanish.</w:t>
       </w:r>
     </w:p>
     <w:p>
@@ -4208,7 +4195,7 @@
         <w:jc w:val="both"/>
       </w:pPr>
       <w:r>
-        <w:t>Production deployment should use Docker containers with Tesseract and Poppler pre-installed. A Dockerfile should include all system dependencies (tesseract-ocr, poppler-utils, language packs) and Python package requirements. A docker-compose configuration can support single-command deployment including the DocIQ application and any downstream consumers.</w:t>
+        <w:t>Production deployment uses Docker containers with Poppler pre-installed. The multi-stage Dockerfile includes all system dependencies (poppler-utils, OpenCV libraries) and Python packages. PaddleOCR models are downloaded during the build step. A docker-compose configuration supports single-command deployment with Nginx reverse proxy, health checks, and resource limits.</w:t>
       </w:r>
     </w:p>
     <w:p>
@@ -4551,7 +4538,7 @@
           </w:tcPr>
           <w:p>
             <w:r>
-              <w:t>Tesseract OCR</w:t>
+              <w:t>PaddleOCR 3.4+</w:t>
             </w:r>
           </w:p>
         </w:tc>
@@ -5136,10 +5123,10 @@
       </w:tblPr>
       <w:tblGrid>
         <w:gridCol w:w="500"/>
-        <w:gridCol w:w="2091"/>
+        <w:gridCol w:w="2088"/>
         <w:gridCol w:w="1052"/>
-        <w:gridCol w:w="1597"/>
-        <w:gridCol w:w="4120"/>
+        <w:gridCol w:w="1596"/>
+        <w:gridCol w:w="4124"/>
       </w:tblGrid>
       <w:tr>
         <w:tc>
@@ -5410,7 +5397,7 @@
               <w:jc w:val="center"/>
             </w:pPr>
             <w:r>
-              <w:t>Image preprocessing pipeline (grayscale + thresholding). Tesseract language pack tuning. Configurable threshold in preprocess.py.</w:t>
+              <w:t>PaddleOCR engine configuration (enable_mkldnn=False for PaddlePaddle 3.x compatibility). Accent-flexible regex system for bilingual text matching. Raw text preservation for downstream LLM enrichment.</w:t>
             </w:r>
           </w:p>
         </w:tc>
@@ -6385,7 +6372,7 @@
         </w:numPr>
       </w:pPr>
       <w:r>
-        <w:t>Set up Python 3.10+ development environment with Tesseract and Poppler system dependencies.</w:t>
+        <w:t>Set up Python 3.10+ development environment with Poppler system dependencies. PaddleOCR models download automatically on first use.</w:t>
       </w:r>
     </w:p>
     <w:p>
@@ -6421,7 +6408,7 @@
         </w:numPr>
       </w:pPr>
       <w:r>
-        <w:t>Integrate pdf2image + Tesseract OCR pipeline for scanned documents.</w:t>
+        <w:t>Integrate pdf2image + PaddleOCR pipeline for scanned documents. Implement accent-flexible regex extraction for bilingual support.</w:t>
       </w:r>
     </w:p>
     <w:p>
@@ -6433,7 +6420,7 @@
         </w:numPr>
       </w:pPr>
       <w:r>
-        <w:t>Implement OpenCV image preprocessing (grayscale + thresholding) for OCR quality.</w:t>
+        <w:t>Implement PaddleOCR integration with thread-safe singleton engine. Add accent-flexible regex for bilingual field extraction.</w:t>
       </w:r>
     </w:p>
     <w:p>
@@ -6729,6 +6716,7 @@
           <w:i/>
           <w:iCs/>
         </w:rPr>
+        <w:lastRenderedPageBreak/>
         <w:t xml:space="preserve">Deliverable: </w:t>
       </w:r>
       <w:r>
@@ -6745,7 +6733,6 @@
         <w:pStyle w:val="Heading2"/>
       </w:pPr>
       <w:r>
-        <w:lastRenderedPageBreak/>
         <w:t>Phase 4: FHIR Mapping &amp; Output Persistence</w:t>
       </w:r>
     </w:p>
@@ -6920,7 +6907,7 @@
         </w:numPr>
       </w:pPr>
       <w:r>
-        <w:t>Dockerise the application with Tesseract, Poppler, and all Python dependencies.</w:t>
+        <w:t>Dockerise the application with Poppler, PaddleOCR, and all Python dependencies. Include Nginx reverse proxy and health checks.</w:t>
       </w:r>
     </w:p>
     <w:p>
@@ -9538,7 +9525,7 @@
           </w:tcPr>
           <w:p>
             <w:r>
-              <w:t>Tesseract</w:t>
+              <w:t>PaddleOCR</w:t>
             </w:r>
           </w:p>
         </w:tc>

</xml_diff>